<commit_message>
fix: harden Scout lineup boundary roles
</commit_message>
<xml_diff>
--- a/docs/NBA-Scout-Analytics-Coaching-Guide.docx
+++ b/docs/NBA-Scout-Analytics-Coaching-Guide.docx
@@ -703,7 +703,7 @@
           <w:color w:val="000000"/>
           <w:sz w:val="22"/>
         </w:rPr>
-        <w:t>Continuity: team possession share, team minute share, games used, and for exact five-player lineups only, starting and closing lineup counts/rates.</w:t>
+        <w:t>Continuity: team possession share, team minute share, games used, and for exact five-player lineups only, starting and closing lineup counts/rates. Starting and closing use the first and final verified exact five observed at a possession start in each eligible game; zero-possession dead-ball lineups are excluded.</w:t>
       </w:r>
     </w:p>
     <w:p>
@@ -2189,7 +2189,7 @@
           <w:color w:val="000000"/>
           <w:sz w:val="22"/>
         </w:rPr>
-        <w:t>Role line: games appeared, reconstructed minutes, team possessions while on court, starter games/rate, and closer games/rate.</w:t>
+        <w:t>Role line: games appeared, reconstructed minutes, team possessions while on court, starter games/rate, and closer games/rate. Role counts use only possession-observed boundary lineups.</w:t>
       </w:r>
     </w:p>
     <w:p>

</xml_diff>